<commit_message>
docs: clarify collector server vs. Azure Arc object in multi-forest setup guide
Co-authored-by: Copilot <223556219+Copilot@users.noreply.github.com>
</commit_message>
<xml_diff>
--- a/docs/ODA-MultiForest-Setup-Leitfaden.docx
+++ b/docs/ODA-MultiForest-Setup-Leitfaden.docx
@@ -124,7 +124,7 @@
               <w:rPr>
                 <w:sz w:val="19"/>
               </w:rPr>
-              <w:t>1.0 – zur Abstimmung mit dem Kunden</w:t>
+              <w:t>1.1 – zur Abstimmung mit dem Kunden (Begriffe Collector/Arc-Objekt)</w:t>
             </w:r>
           </w:p>
         </w:tc>
@@ -1275,6 +1275,488 @@
                 <w:sz w:val="19"/>
               </w:rPr>
               <w:t>laufend</w:t>
+            </w:r>
+          </w:p>
+        </w:tc>
+      </w:tr>
+    </w:tbl>
+    <w:p>
+      <w:pPr>
+        <w:spacing w:after="40"/>
+      </w:pPr>
+    </w:p>
+    <w:p>
+      <w:pPr>
+        <w:pStyle w:val="Heading2"/>
+      </w:pPr>
+      <w:r>
+        <w:t>1.2 Begriffe: Collector-Server und Arc-Objekt</w:t>
+      </w:r>
+    </w:p>
+    <w:p>
+      <w:pPr>
+        <w:spacing w:after="80"/>
+      </w:pPr>
+      <w:r>
+        <w:rPr>
+          <w:i w:val="0"/>
+        </w:rPr>
+        <w:t>„Collector“ meint in diesem Leitfaden den Windows-Server on-prem, auf dem die Assessments laufen (bei Microsoft „Data Collection Machine“). Beim Arc-Onboarding (B6) entsteht in Azure ein Abbild dieses Servers: das Arc-Objekt (Ressourcentyp Microsoft.HybridCompute/machines, gleicher Name, in der Resource Group des Forests). Es ist ein und derselbe Rechner, aber manche Schritte betreffen den Server und andere das Arc-Objekt:</w:t>
+      </w:r>
+    </w:p>
+    <w:tbl>
+      <w:tblPr>
+        <w:tblStyle w:val="TableGrid"/>
+        <w:tblW w:type="auto" w:w="0"/>
+        <w:jc w:val="center"/>
+        <w:tblLayout w:type="fixed"/>
+        <w:tblLook w:firstColumn="1" w:firstRow="1" w:lastColumn="0" w:lastRow="0" w:noHBand="0" w:noVBand="1" w:val="04A0"/>
+      </w:tblPr>
+      <w:tblGrid>
+        <w:gridCol w:w="3515"/>
+        <w:gridCol w:w="2041"/>
+        <w:gridCol w:w="3798"/>
+      </w:tblGrid>
+      <w:tr>
+        <w:tc>
+          <w:tcPr>
+            <w:tcW w:type="dxa" w:w="3515"/>
+            <w:shd w:val="clear" w:color="auto" w:fill="1F3A5F"/>
+          </w:tcPr>
+          <w:p>
+            <w:r/>
+            <w:r>
+              <w:rPr>
+                <w:b/>
+                <w:color w:val="FFFFFF"/>
+                <w:sz w:val="19"/>
+              </w:rPr>
+              <w:t>Schritt</w:t>
+            </w:r>
+          </w:p>
+        </w:tc>
+        <w:tc>
+          <w:tcPr>
+            <w:tcW w:type="dxa" w:w="2041"/>
+            <w:shd w:val="clear" w:color="auto" w:fill="1F3A5F"/>
+          </w:tcPr>
+          <w:p>
+            <w:r/>
+            <w:r>
+              <w:rPr>
+                <w:b/>
+                <w:color w:val="FFFFFF"/>
+                <w:sz w:val="19"/>
+              </w:rPr>
+              <w:t>Gemeint ist</w:t>
+            </w:r>
+          </w:p>
+        </w:tc>
+        <w:tc>
+          <w:tcPr>
+            <w:tcW w:type="dxa" w:w="3798"/>
+            <w:shd w:val="clear" w:color="auto" w:fill="1F3A5F"/>
+          </w:tcPr>
+          <w:p>
+            <w:r/>
+            <w:r>
+              <w:rPr>
+                <w:b/>
+                <w:color w:val="FFFFFF"/>
+                <w:sz w:val="19"/>
+              </w:rPr>
+              <w:t>Erläuterung</w:t>
+            </w:r>
+          </w:p>
+        </w:tc>
+      </w:tr>
+      <w:tr>
+        <w:tc>
+          <w:tcPr>
+            <w:tcW w:type="dxa" w:w="3515"/>
+          </w:tcPr>
+          <w:p>
+            <w:r/>
+            <w:r>
+              <w:rPr>
+                <w:sz w:val="19"/>
+              </w:rPr>
+              <w:t>B1–B5: Server, Domänenbeitritt, Netzwerk, GPO, gMSA, C:\Assessments</w:t>
+            </w:r>
+          </w:p>
+        </w:tc>
+        <w:tc>
+          <w:tcPr>
+            <w:tcW w:type="dxa" w:w="2041"/>
+          </w:tcPr>
+          <w:p>
+            <w:r/>
+            <w:r>
+              <w:rPr>
+                <w:sz w:val="19"/>
+              </w:rPr>
+              <w:t>Collector-Server (on-prem)</w:t>
+            </w:r>
+          </w:p>
+        </w:tc>
+        <w:tc>
+          <w:tcPr>
+            <w:tcW w:type="dxa" w:w="3798"/>
+          </w:tcPr>
+          <w:p>
+            <w:r/>
+            <w:r>
+              <w:rPr>
+                <w:sz w:val="19"/>
+              </w:rPr>
+              <w:t>Klassische Server- und AD-Administration im Forest</w:t>
+            </w:r>
+          </w:p>
+        </w:tc>
+      </w:tr>
+      <w:tr>
+        <w:tc>
+          <w:tcPr>
+            <w:tcW w:type="dxa" w:w="3515"/>
+          </w:tcPr>
+          <w:p>
+            <w:r/>
+            <w:r>
+              <w:rPr>
+                <w:sz w:val="19"/>
+              </w:rPr>
+              <w:t>B6: azcmagent connect / check</w:t>
+            </w:r>
+          </w:p>
+        </w:tc>
+        <w:tc>
+          <w:tcPr>
+            <w:tcW w:type="dxa" w:w="2041"/>
+          </w:tcPr>
+          <w:p>
+            <w:r/>
+            <w:r>
+              <w:rPr>
+                <w:sz w:val="19"/>
+              </w:rPr>
+              <w:t>Collector-Server</w:t>
+            </w:r>
+          </w:p>
+        </w:tc>
+        <w:tc>
+          <w:tcPr>
+            <w:tcW w:type="dxa" w:w="3798"/>
+          </w:tcPr>
+          <w:p>
+            <w:r/>
+            <w:r>
+              <w:rPr>
+                <w:sz w:val="19"/>
+              </w:rPr>
+              <w:t>Der Arc-Agent wird auf dem Server installiert und erzeugt dabei das Arc-Objekt</w:t>
+            </w:r>
+          </w:p>
+        </w:tc>
+      </w:tr>
+      <w:tr>
+        <w:tc>
+          <w:tcPr>
+            <w:tcW w:type="dxa" w:w="3515"/>
+          </w:tcPr>
+          <w:p>
+            <w:r/>
+            <w:r>
+              <w:rPr>
+                <w:sz w:val="19"/>
+              </w:rPr>
+              <w:t>B6: Resource Group rg-oda-&lt;forest&gt;</w:t>
+            </w:r>
+          </w:p>
+        </w:tc>
+        <w:tc>
+          <w:tcPr>
+            <w:tcW w:type="dxa" w:w="2041"/>
+          </w:tcPr>
+          <w:p>
+            <w:r/>
+            <w:r>
+              <w:rPr>
+                <w:sz w:val="19"/>
+              </w:rPr>
+              <w:t>Arc-Objekt</w:t>
+            </w:r>
+          </w:p>
+        </w:tc>
+        <w:tc>
+          <w:tcPr>
+            <w:tcW w:type="dxa" w:w="3798"/>
+          </w:tcPr>
+          <w:p>
+            <w:r/>
+            <w:r>
+              <w:rPr>
+                <w:sz w:val="19"/>
+              </w:rPr>
+              <w:t>Legt fest, in welcher RG der Server in Azure erscheint</w:t>
+            </w:r>
+          </w:p>
+        </w:tc>
+      </w:tr>
+      <w:tr>
+        <w:tc>
+          <w:tcPr>
+            <w:tcW w:type="dxa" w:w="3515"/>
+          </w:tcPr>
+          <w:p>
+            <w:r/>
+            <w:r>
+              <w:rPr>
+                <w:sz w:val="19"/>
+              </w:rPr>
+              <w:t>B7: Azure Monitor Agent</w:t>
+            </w:r>
+          </w:p>
+        </w:tc>
+        <w:tc>
+          <w:tcPr>
+            <w:tcW w:type="dxa" w:w="2041"/>
+          </w:tcPr>
+          <w:p>
+            <w:r/>
+            <w:r>
+              <w:rPr>
+                <w:sz w:val="19"/>
+              </w:rPr>
+              <w:t>Arc-Objekt → Collector-Server</w:t>
+            </w:r>
+          </w:p>
+        </w:tc>
+        <w:tc>
+          <w:tcPr>
+            <w:tcW w:type="dxa" w:w="3798"/>
+          </w:tcPr>
+          <w:p>
+            <w:r/>
+            <w:r>
+              <w:rPr>
+                <w:sz w:val="19"/>
+              </w:rPr>
+              <w:t>Die Extension wird am Arc-Objekt angelegt und als Agent auf dem Server installiert</w:t>
+            </w:r>
+          </w:p>
+        </w:tc>
+      </w:tr>
+      <w:tr>
+        <w:tc>
+          <w:tcPr>
+            <w:tcW w:type="dxa" w:w="3515"/>
+          </w:tcPr>
+          <w:p>
+            <w:r/>
+            <w:r>
+              <w:rPr>
+                <w:sz w:val="19"/>
+              </w:rPr>
+              <w:t>B8: Extension-Allowlist</w:t>
+            </w:r>
+          </w:p>
+        </w:tc>
+        <w:tc>
+          <w:tcPr>
+            <w:tcW w:type="dxa" w:w="2041"/>
+          </w:tcPr>
+          <w:p>
+            <w:r/>
+            <w:r>
+              <w:rPr>
+                <w:sz w:val="19"/>
+              </w:rPr>
+              <w:t>Collector-Server</w:t>
+            </w:r>
+          </w:p>
+        </w:tc>
+        <w:tc>
+          <w:tcPr>
+            <w:tcW w:type="dxa" w:w="3798"/>
+          </w:tcPr>
+          <w:p>
+            <w:r/>
+            <w:r>
+              <w:rPr>
+                <w:sz w:val="19"/>
+              </w:rPr>
+              <w:t>Wird lokal per azcmagent gesetzt und begrenzt, was über das Arc-Objekt installiert werden darf</w:t>
+            </w:r>
+          </w:p>
+        </w:tc>
+      </w:tr>
+      <w:tr>
+        <w:tc>
+          <w:tcPr>
+            <w:tcW w:type="dxa" w:w="3515"/>
+          </w:tcPr>
+          <w:p>
+            <w:r/>
+            <w:r>
+              <w:rPr>
+                <w:sz w:val="19"/>
+              </w:rPr>
+              <w:t>C1: „Machine“ im Connector</w:t>
+            </w:r>
+          </w:p>
+        </w:tc>
+        <w:tc>
+          <w:tcPr>
+            <w:tcW w:type="dxa" w:w="2041"/>
+          </w:tcPr>
+          <w:p>
+            <w:r/>
+            <w:r>
+              <w:rPr>
+                <w:sz w:val="19"/>
+              </w:rPr>
+              <w:t>Arc-Objekt</w:t>
+            </w:r>
+          </w:p>
+        </w:tc>
+        <w:tc>
+          <w:tcPr>
+            <w:tcW w:type="dxa" w:w="3798"/>
+          </w:tcPr>
+          <w:p>
+            <w:r/>
+            <w:r>
+              <w:rPr>
+                <w:sz w:val="19"/>
+              </w:rPr>
+              <w:t>Deshalb muss das Arc-Objekt in Subscription/RG des aktiven LAW liegen</w:t>
+            </w:r>
+          </w:p>
+        </w:tc>
+      </w:tr>
+      <w:tr>
+        <w:tc>
+          <w:tcPr>
+            <w:tcW w:type="dxa" w:w="3515"/>
+          </w:tcPr>
+          <w:p>
+            <w:r/>
+            <w:r>
+              <w:rPr>
+                <w:sz w:val="19"/>
+              </w:rPr>
+              <w:t>C2–C3: Add-ADAssessmentTask, geplante Aufgaben, OMSAssessment.exe</w:t>
+            </w:r>
+          </w:p>
+        </w:tc>
+        <w:tc>
+          <w:tcPr>
+            <w:tcW w:type="dxa" w:w="2041"/>
+          </w:tcPr>
+          <w:p>
+            <w:r/>
+            <w:r>
+              <w:rPr>
+                <w:sz w:val="19"/>
+              </w:rPr>
+              <w:t>Collector-Server</w:t>
+            </w:r>
+          </w:p>
+        </w:tc>
+        <w:tc>
+          <w:tcPr>
+            <w:tcW w:type="dxa" w:w="3798"/>
+          </w:tcPr>
+          <w:p>
+            <w:r/>
+            <w:r>
+              <w:rPr>
+                <w:sz w:val="19"/>
+              </w:rPr>
+              <w:t>Lokal auf dem Server, als Administrator</w:t>
+            </w:r>
+          </w:p>
+        </w:tc>
+      </w:tr>
+      <w:tr>
+        <w:tc>
+          <w:tcPr>
+            <w:tcW w:type="dxa" w:w="3515"/>
+          </w:tcPr>
+          <w:p>
+            <w:r/>
+            <w:r>
+              <w:rPr>
+                <w:sz w:val="19"/>
+              </w:rPr>
+              <w:t>A6: Log Analytics Reader „auf der Arc-Maschine“</w:t>
+            </w:r>
+          </w:p>
+        </w:tc>
+        <w:tc>
+          <w:tcPr>
+            <w:tcW w:type="dxa" w:w="2041"/>
+          </w:tcPr>
+          <w:p>
+            <w:r/>
+            <w:r>
+              <w:rPr>
+                <w:sz w:val="19"/>
+              </w:rPr>
+              <w:t>Arc-Objekt</w:t>
+            </w:r>
+          </w:p>
+        </w:tc>
+        <w:tc>
+          <w:tcPr>
+            <w:tcW w:type="dxa" w:w="3798"/>
+          </w:tcPr>
+          <w:p>
+            <w:r/>
+            <w:r>
+              <w:rPr>
+                <w:sz w:val="19"/>
+              </w:rPr>
+              <w:t>Azure-Rollenzuweisung auf die Ressource</w:t>
+            </w:r>
+          </w:p>
+        </w:tc>
+      </w:tr>
+    </w:tbl>
+    <w:p>
+      <w:pPr>
+        <w:spacing w:after="40"/>
+      </w:pPr>
+    </w:p>
+    <w:tbl>
+      <w:tblPr>
+        <w:tblStyle w:val="TableGrid"/>
+        <w:tblW w:type="auto" w:w="0"/>
+        <w:tblLook w:firstColumn="1" w:firstRow="1" w:lastColumn="0" w:lastRow="0" w:noHBand="0" w:noVBand="1" w:val="04A0"/>
+      </w:tblPr>
+      <w:tblGrid>
+        <w:gridCol w:w="9746"/>
+      </w:tblGrid>
+      <w:tr>
+        <w:tc>
+          <w:tcPr>
+            <w:tcW w:type="dxa" w:w="9746"/>
+            <w:shd w:val="clear" w:color="auto" w:fill="DEEBF7"/>
+          </w:tcPr>
+          <w:p>
+            <w:r/>
+            <w:r>
+              <w:rPr>
+                <w:b/>
+                <w:sz w:val="19"/>
+              </w:rPr>
+              <w:t xml:space="preserve">Konsequenz: </w:t>
+            </w:r>
+            <w:r>
+              <w:rPr>
+                <w:sz w:val="19"/>
+              </w:rPr>
+              <w:t>Rechte am Arc-Objekt wirken direkt auf den Server. Wer dort Contributor ist (oder Extensions bzw. Run Command nutzen darf), kann Code als SYSTEM auf dem Collector ausführen und damit das Assessment-Konto missbrauchen. Deshalb sind Collector-Server UND Arc-Objekt Tier-0 des jeweiligen Forests (siehe A6 und B8).</w:t>
             </w:r>
           </w:p>
         </w:tc>

</xml_diff>